<commit_message>
Generic rapor sistemi genişletme, checkbox handler iyileştirmeleri, template config ve şablon güncellemeleri
- genericWordService: autoDetectAndFill, checkbox direction "after", radio groups, labelsMatch desteği
- wordCheckboxHandler: gelişmiş checkbox işleme ve yön desteği
- wordCellOperations: hücre operasyonları iyileştirmeleri
- Elektrik servisleri (topraklama, iç tesisat) güncelleme ve düzeltmeler
- 50+ template config güncelleme (kanca, kontrol soruları, checkbox düzeltmeleri)
- Yeni elektrik config'ler: FR7.2.37, FR7.2.38, FR7.2.41E, FR7.2.49E, FR7.2.73E
- generic-rapor-form.html genişletildi
- 150+ Word şablon dosyası güncellendi

Co-Authored-By: Claude Opus 4.6 <noreply@anthropic.com>
</commit_message>
<xml_diff>
--- a/templates/elektrik/FR7.2.36 Elektrik Topraklama Ölçüm Raporu şablon.docx
+++ b/templates/elektrik/FR7.2.36 Elektrik Topraklama Ölçüm Raporu şablon.docx
@@ -25998,7 +25998,7 @@
               <w:sz w:val="16"/>
               <w:szCs w:val="18"/>
             </w:rPr>
-            <w:t xml:space="preserve">Fetih Mahallesi Aslanlı Kışla </w:t>
+            <w:t xml:space="preserve">Akabe Mahallesi Aslanlı Kışla </w:t>
           </w:r>
           <w:proofErr w:type="spellStart"/>
           <w:r>
@@ -26426,7 +26426,7 @@
               <w:sz w:val="16"/>
               <w:szCs w:val="18"/>
             </w:rPr>
-            <w:t xml:space="preserve">Fetih Mahallesi Aslanlı Kışla </w:t>
+            <w:t xml:space="preserve">Akabe Mahallesi Aslanlı Kışla </w:t>
           </w:r>
           <w:proofErr w:type="spellStart"/>
           <w:r>

</xml_diff>